<commit_message>
Update contact email and membership contract file
</commit_message>
<xml_diff>
--- a/files/membership-contract.docx
+++ b/files/membership-contract.docx
@@ -2430,7 +2430,19 @@
         <w:rPr>
           <w:rFonts w:ascii="Times New Roman" w:eastAsia="標楷體" w:hAnsi="Times New Roman" w:cs="Times New Roman" w:hint="eastAsia"/>
         </w:rPr>
-        <w:t xml:space="preserve"> XXXX@gate.sinica.edu.tw</w:t>
+        <w:t xml:space="preserve"> </w:t>
+      </w:r>
+      <w:r>
+        <w:rPr>
+          <w:rFonts w:ascii="Times New Roman" w:eastAsia="標楷體" w:hAnsi="Times New Roman" w:cs="Times New Roman"/>
+        </w:rPr>
+        <w:t>wcheng</w:t>
+      </w:r>
+      <w:r>
+        <w:rPr>
+          <w:rFonts w:ascii="Times New Roman" w:eastAsia="標楷體" w:hAnsi="Times New Roman" w:cs="Times New Roman" w:hint="eastAsia"/>
+        </w:rPr>
+        <w:t>@gate.sinica.edu.tw</w:t>
       </w:r>
     </w:p>
     <w:p>
@@ -2492,6 +2504,8 @@
         </w:rPr>
         <w:t>乙方指定匯款帳戶資料如下：</w:t>
       </w:r>
+      <w:bookmarkStart w:id="0" w:name="_GoBack"/>
+      <w:bookmarkEnd w:id="0"/>
       <w:r>
         <w:rPr>
           <w:rFonts w:ascii="Times New Roman" w:eastAsia="標楷體" w:hAnsi="Times New Roman" w:cs="Times New Roman"/>
@@ -6235,8 +6249,6 @@
         </w:rPr>
         <w:t xml:space="preserve"> </w:t>
       </w:r>
-      <w:bookmarkStart w:id="0" w:name="_GoBack"/>
-      <w:bookmarkEnd w:id="0"/>
       <w:r>
         <w:rPr>
           <w:rFonts w:ascii="Times New Roman" w:eastAsia="標楷體" w:hAnsi="Times New Roman" w:cs="Times New Roman" w:hint="eastAsia"/>

</xml_diff>

<commit_message>
Update membership contract Word download
</commit_message>
<xml_diff>
--- a/files/membership-contract.docx
+++ b/files/membership-contract.docx
@@ -2421,6 +2421,19 @@
         </w:rPr>
       </w:pPr>
       <w:r>
+        <w:t>□ wcheng@gate.sinica.edu.tw</w:t>
+      </w:r>
+    </w:p>
+    <w:p>
+      <w:pPr>
+        <w:adjustRightInd w:val="0"/>
+        <w:snapToGrid w:val="0"/>
+        <w:spacing w:after="0" w:line="240" w:lineRule="auto"/>
+        <w:rPr>
+          <w:rFonts w:ascii="Times New Roman" w:eastAsia="標楷體" w:hAnsi="Times New Roman" w:cs="Times New Roman"/>
+        </w:rPr>
+      </w:pPr>
+      <w:r>
         <w:rPr>
           <w:rFonts w:ascii="Times New Roman" w:eastAsia="標楷體" w:hAnsi="Times New Roman" w:cs="Times New Roman" w:hint="eastAsia"/>
         </w:rPr>
@@ -2434,40 +2447,6 @@
       </w:r>
       <w:r>
         <w:rPr>
-          <w:rFonts w:ascii="Times New Roman" w:eastAsia="標楷體" w:hAnsi="Times New Roman" w:cs="Times New Roman"/>
-        </w:rPr>
-        <w:t>wcheng</w:t>
-      </w:r>
-      <w:r>
-        <w:rPr>
-          <w:rFonts w:ascii="Times New Roman" w:eastAsia="標楷體" w:hAnsi="Times New Roman" w:cs="Times New Roman" w:hint="eastAsia"/>
-        </w:rPr>
-        <w:t>@gate.sinica.edu.tw</w:t>
-      </w:r>
-    </w:p>
-    <w:p>
-      <w:pPr>
-        <w:adjustRightInd w:val="0"/>
-        <w:snapToGrid w:val="0"/>
-        <w:spacing w:after="0" w:line="240" w:lineRule="auto"/>
-        <w:rPr>
-          <w:rFonts w:ascii="Times New Roman" w:eastAsia="標楷體" w:hAnsi="Times New Roman" w:cs="Times New Roman"/>
-        </w:rPr>
-      </w:pPr>
-      <w:r>
-        <w:rPr>
-          <w:rFonts w:ascii="Times New Roman" w:eastAsia="標楷體" w:hAnsi="Times New Roman" w:cs="Times New Roman" w:hint="eastAsia"/>
-        </w:rPr>
-        <w:t>□</w:t>
-      </w:r>
-      <w:r>
-        <w:rPr>
-          <w:rFonts w:ascii="Times New Roman" w:eastAsia="標楷體" w:hAnsi="Times New Roman" w:cs="Times New Roman" w:hint="eastAsia"/>
-        </w:rPr>
-        <w:t xml:space="preserve"> </w:t>
-      </w:r>
-      <w:r>
-        <w:rPr>
           <w:rFonts w:ascii="Times New Roman" w:eastAsia="標楷體" w:hAnsi="Times New Roman" w:cs="Times New Roman" w:hint="eastAsia"/>
         </w:rPr>
         <w:t>其他：</w:t>
@@ -2504,8 +2483,6 @@
         </w:rPr>
         <w:t>乙方指定匯款帳戶資料如下：</w:t>
       </w:r>
-      <w:bookmarkStart w:id="0" w:name="_GoBack"/>
-      <w:bookmarkEnd w:id="0"/>
       <w:r>
         <w:rPr>
           <w:rFonts w:ascii="Times New Roman" w:eastAsia="標楷體" w:hAnsi="Times New Roman" w:cs="Times New Roman"/>
@@ -6249,6 +6226,8 @@
         </w:rPr>
         <w:t xml:space="preserve"> </w:t>
       </w:r>
+      <w:bookmarkStart w:id="0" w:name="_GoBack"/>
+      <w:bookmarkEnd w:id="0"/>
       <w:r>
         <w:rPr>
           <w:rFonts w:ascii="Times New Roman" w:eastAsia="標楷體" w:hAnsi="Times New Roman" w:cs="Times New Roman" w:hint="eastAsia"/>

</xml_diff>

<commit_message>
Fix membership contract Word file formatting and email
</commit_message>
<xml_diff>
--- a/files/membership-contract.docx
+++ b/files/membership-contract.docx
@@ -2421,7 +2421,16 @@
         </w:rPr>
       </w:pPr>
       <w:r>
-        <w:t>□ wcheng@gate.sinica.edu.tw</w:t>
+        <w:rPr>
+          <w:rFonts w:ascii="Times New Roman" w:eastAsia="標楷體" w:hAnsi="Times New Roman" w:cs="Times New Roman" w:hint="eastAsia"/>
+        </w:rPr>
+        <w:t>□</w:t>
+      </w:r>
+      <w:r>
+        <w:rPr>
+          <w:rFonts w:ascii="Times New Roman" w:eastAsia="標楷體" w:hAnsi="Times New Roman" w:cs="Times New Roman" w:hint="eastAsia"/>
+        </w:rPr>
+        <w:t xml:space="preserve"> wcheng@gate.sinica.edu.tw</w:t>
       </w:r>
     </w:p>
     <w:p>

</xml_diff>

<commit_message>
Restore membership contract Word file (wcheng@gate.sinica.edu.tw)
</commit_message>
<xml_diff>
--- a/files/membership-contract.docx
+++ b/files/membership-contract.docx
@@ -2430,7 +2430,19 @@
         <w:rPr>
           <w:rFonts w:ascii="Times New Roman" w:eastAsia="標楷體" w:hAnsi="Times New Roman" w:cs="Times New Roman" w:hint="eastAsia"/>
         </w:rPr>
-        <w:t xml:space="preserve"> wcheng@gate.sinica.edu.tw</w:t>
+        <w:t xml:space="preserve"> </w:t>
+      </w:r>
+      <w:r>
+        <w:rPr>
+          <w:rFonts w:ascii="Times New Roman" w:eastAsia="標楷體" w:hAnsi="Times New Roman" w:cs="Times New Roman"/>
+        </w:rPr>
+        <w:t>wcheng</w:t>
+      </w:r>
+      <w:r>
+        <w:rPr>
+          <w:rFonts w:ascii="Times New Roman" w:eastAsia="標楷體" w:hAnsi="Times New Roman" w:cs="Times New Roman" w:hint="eastAsia"/>
+        </w:rPr>
+        <w:t>@gate.sinica.edu.tw</w:t>
       </w:r>
     </w:p>
     <w:p>
@@ -2492,6 +2504,8 @@
         </w:rPr>
         <w:t>乙方指定匯款帳戶資料如下：</w:t>
       </w:r>
+      <w:bookmarkStart w:id="0" w:name="_GoBack"/>
+      <w:bookmarkEnd w:id="0"/>
       <w:r>
         <w:rPr>
           <w:rFonts w:ascii="Times New Roman" w:eastAsia="標楷體" w:hAnsi="Times New Roman" w:cs="Times New Roman"/>
@@ -6235,8 +6249,6 @@
         </w:rPr>
         <w:t xml:space="preserve"> </w:t>
       </w:r>
-      <w:bookmarkStart w:id="0" w:name="_GoBack"/>
-      <w:bookmarkEnd w:id="0"/>
       <w:r>
         <w:rPr>
           <w:rFonts w:ascii="Times New Roman" w:eastAsia="標楷體" w:hAnsi="Times New Roman" w:cs="Times New Roman" w:hint="eastAsia"/>

</xml_diff>

<commit_message>
Update membership contract: president changed to Chen Chien-jen
</commit_message>
<xml_diff>
--- a/files/membership-contract.docx
+++ b/files/membership-contract.docx
@@ -2504,8 +2504,6 @@
         </w:rPr>
         <w:t>乙方指定匯款帳戶資料如下：</w:t>
       </w:r>
-      <w:bookmarkStart w:id="0" w:name="_GoBack"/>
-      <w:bookmarkEnd w:id="0"/>
       <w:r>
         <w:rPr>
           <w:rFonts w:ascii="Times New Roman" w:eastAsia="標楷體" w:hAnsi="Times New Roman" w:cs="Times New Roman"/>
@@ -6208,8 +6206,10 @@
           <w:sz w:val="28"/>
           <w:szCs w:val="28"/>
         </w:rPr>
-        <w:t>廖俊智</w:t>
-      </w:r>
+        <w:t>陳建仁</w:t>
+      </w:r>
+      <w:bookmarkStart w:id="0" w:name="_GoBack"/>
+      <w:bookmarkEnd w:id="0"/>
     </w:p>
     <w:p>
       <w:pPr>
@@ -8585,7 +8585,7 @@
         <w:noProof/>
         <w:sz w:val="18"/>
       </w:rPr>
-      <w:t>2026/5/29</w:t>
+      <w:t>2026/5/31</w:t>
     </w:r>
     <w:r>
       <w:rPr>

</xml_diff>